<commit_message>
refactor: chuyen doi toan bo he thong de sang kien truc Master Main LaTeX voi macro tieu de va kiem tra ban quyen Co Thuy
</commit_message>
<xml_diff>
--- a/pdf2word/San_Pham/PHY10_Nguyen_Hue_HDG_101.docx
+++ b/pdf2word/San_Pham/PHY10_Nguyen_Hue_HDG_101.docx
@@ -125,14 +125,14 @@
                 <w:b/>
                 <w:sz w:val="21"/>
               </w:rPr>
-              <w:t xml:space="preserve"> Họ tên: </w:t>
+              <w:t xml:space="preserve"> Giáo viên: </w:t>
             </w:r>
             <w:r>
               <w:rPr>
                 <w:rFonts w:ascii="Times New Roman" w:hAnsi="Times New Roman"/>
                 <w:sz w:val="21"/>
               </w:rPr>
-              <w:t xml:space="preserve">BÙI THỊ HỒNG THÚY     </w:t>
+              <w:t xml:space="preserve">HỒ THỊ THÚY     </w:t>
             </w:r>
             <w:r>
               <w:rPr>

</xml_diff>